<commit_message>
finish upload image for create campground
</commit_message>
<xml_diff>
--- a/2-NodeJs/YELPCAMP.docx
+++ b/2-NodeJs/YELPCAMP.docx
@@ -637,6 +637,7 @@
       <w:r>
         <w:rPr>
           <w:rFonts w:ascii="Andale Mono" w:hAnsi="Andale Mono"/>
+          <w:noProof/>
           <w:sz w:val="32"/>
           <w:szCs w:val="32"/>
           <w:lang w:val="en-US"/>
@@ -723,16 +724,7 @@
           <w:szCs w:val="32"/>
           <w:lang w:val="en-US"/>
         </w:rPr>
-        <w:t>logger middleware</w:t>
-      </w:r>
-      <w:r>
-        <w:rPr>
-          <w:rFonts w:ascii="Andale Mono" w:hAnsi="Andale Mono"/>
-          <w:sz w:val="32"/>
-          <w:szCs w:val="32"/>
-          <w:lang w:val="en-US"/>
-        </w:rPr>
-        <w:t>: a middleware that record what’s happening for each request</w:t>
+        <w:t>logger middleware: a middleware that record what’s happening for each request</w:t>
       </w:r>
     </w:p>
     <w:p>
@@ -1076,6 +1068,7 @@
       </w:pPr>
       <w:r>
         <w:rPr>
+          <w:noProof/>
           <w:lang w:val="en-US"/>
         </w:rPr>
         <w:drawing>
@@ -1123,6 +1116,7 @@
       <w:r>
         <w:rPr>
           <w:rFonts w:ascii="Andale Mono" w:hAnsi="Andale Mono"/>
+          <w:noProof/>
           <w:sz w:val="32"/>
           <w:szCs w:val="32"/>
           <w:lang w:val="en-US"/>
@@ -1358,32 +1352,226 @@
     </w:p>
     <w:p>
       <w:pPr>
-        <w:ind w:left="360"/>
-        <w:rPr>
-          <w:rFonts w:ascii="Andale Mono" w:hAnsi="Andale Mono"/>
-          <w:sz w:val="32"/>
-          <w:szCs w:val="32"/>
-          <w:lang w:val="en-US"/>
-        </w:rPr>
-      </w:pPr>
-    </w:p>
-    <w:p>
-      <w:pPr>
-        <w:ind w:left="360"/>
-        <w:rPr>
-          <w:rFonts w:ascii="Andale Mono" w:hAnsi="Andale Mono"/>
-          <w:sz w:val="32"/>
-          <w:szCs w:val="32"/>
-          <w:lang w:val="en-US"/>
-        </w:rPr>
-      </w:pPr>
-    </w:p>
-    <w:p>
-      <w:pPr>
-        <w:rPr>
-          <w:rFonts w:ascii="Andale Mono" w:hAnsi="Andale Mono"/>
-          <w:sz w:val="32"/>
-          <w:szCs w:val="32"/>
+        <w:rPr>
+          <w:rFonts w:ascii="Andale Mono" w:hAnsi="Andale Mono"/>
+          <w:sz w:val="32"/>
+          <w:szCs w:val="32"/>
+          <w:lang w:val="en-US"/>
+        </w:rPr>
+      </w:pPr>
+    </w:p>
+    <w:p>
+      <w:pPr>
+        <w:pBdr>
+          <w:bottom w:val="single" w:sz="6" w:space="1" w:color="auto"/>
+        </w:pBdr>
+        <w:rPr>
+          <w:rFonts w:ascii="Andale Mono" w:hAnsi="Andale Mono" w:cs="Browallia New"/>
+          <w:b/>
+          <w:bCs/>
+          <w:sz w:val="36"/>
+          <w:szCs w:val="36"/>
+          <w:lang w:val="en-US"/>
+        </w:rPr>
+      </w:pPr>
+    </w:p>
+    <w:p>
+      <w:pPr>
+        <w:jc w:val="center"/>
+        <w:rPr>
+          <w:rFonts w:ascii="Andale Mono" w:hAnsi="Andale Mono" w:cs="Browallia New"/>
+          <w:b/>
+          <w:bCs/>
+          <w:sz w:val="36"/>
+          <w:szCs w:val="36"/>
+          <w:lang w:val="en-US"/>
+        </w:rPr>
+      </w:pPr>
+      <w:r>
+        <w:rPr>
+          <w:rFonts w:ascii="Andale Mono" w:hAnsi="Andale Mono" w:cs="Browallia New"/>
+          <w:b/>
+          <w:bCs/>
+          <w:sz w:val="36"/>
+          <w:szCs w:val="36"/>
+          <w:lang w:val="en-US"/>
+        </w:rPr>
+        <w:t>Upload</w:t>
+      </w:r>
+    </w:p>
+    <w:p>
+      <w:pPr>
+        <w:pStyle w:val="ListParagraph"/>
+        <w:numPr>
+          <w:ilvl w:val="0"/>
+          <w:numId w:val="2"/>
+        </w:numPr>
+        <w:rPr>
+          <w:rFonts w:ascii="Andale Mono" w:hAnsi="Andale Mono"/>
+          <w:sz w:val="28"/>
+          <w:szCs w:val="28"/>
+          <w:lang w:val="en-US"/>
+        </w:rPr>
+      </w:pPr>
+      <w:r>
+        <w:rPr>
+          <w:rFonts w:ascii="Andale Mono" w:hAnsi="Andale Mono" w:cs="Browallia New"/>
+          <w:sz w:val="32"/>
+          <w:szCs w:val="32"/>
+          <w:lang w:val="en-US"/>
+        </w:rPr>
+        <w:t>We need to install ‘NPM I Multer’</w:t>
+      </w:r>
+      <w:r>
+        <w:rPr>
+          <w:rFonts w:ascii="Andale Mono" w:hAnsi="Andale Mono" w:cs="Browallia New"/>
+          <w:sz w:val="32"/>
+          <w:szCs w:val="32"/>
+          <w:lang w:val="en-US"/>
+        </w:rPr>
+        <w:t xml:space="preserve"> for receive multiple files</w:t>
+      </w:r>
+    </w:p>
+    <w:p>
+      <w:pPr>
+        <w:pStyle w:val="ListParagraph"/>
+        <w:numPr>
+          <w:ilvl w:val="1"/>
+          <w:numId w:val="2"/>
+        </w:numPr>
+        <w:rPr>
+          <w:rFonts w:ascii="Andale Mono" w:hAnsi="Andale Mono"/>
+          <w:sz w:val="28"/>
+          <w:szCs w:val="28"/>
+          <w:lang w:val="en-US"/>
+        </w:rPr>
+      </w:pPr>
+      <w:r>
+        <w:rPr>
+          <w:rFonts w:ascii="Andale Mono" w:hAnsi="Andale Mono" w:cs="Browallia New"/>
+          <w:sz w:val="32"/>
+          <w:szCs w:val="32"/>
+          <w:lang w:val="en-US"/>
+        </w:rPr>
+        <w:t>We can parse JSON, parse URL encoded from form</w:t>
+      </w:r>
+    </w:p>
+    <w:p>
+      <w:pPr>
+        <w:pStyle w:val="ListParagraph"/>
+        <w:numPr>
+          <w:ilvl w:val="1"/>
+          <w:numId w:val="2"/>
+        </w:numPr>
+        <w:rPr>
+          <w:rFonts w:ascii="Andale Mono" w:hAnsi="Andale Mono"/>
+          <w:sz w:val="28"/>
+          <w:szCs w:val="28"/>
+          <w:lang w:val="en-US"/>
+        </w:rPr>
+      </w:pPr>
+      <w:r>
+        <w:rPr>
+          <w:rFonts w:ascii="Andale Mono" w:hAnsi="Andale Mono" w:cs="Browallia New"/>
+          <w:sz w:val="32"/>
+          <w:szCs w:val="32"/>
+          <w:lang w:val="en-US"/>
+        </w:rPr>
+        <w:t xml:space="preserve">It adds </w:t>
+      </w:r>
+      <w:r>
+        <w:rPr>
+          <w:rFonts w:ascii="Andale Mono" w:hAnsi="Andale Mono" w:cs="Browallia New"/>
+          <w:sz w:val="32"/>
+          <w:szCs w:val="32"/>
+          <w:lang w:val="en-US"/>
+        </w:rPr>
+        <w:t>file(object) or files(array) to req</w:t>
+      </w:r>
+    </w:p>
+    <w:p>
+      <w:pPr>
+        <w:pStyle w:val="ListParagraph"/>
+        <w:numPr>
+          <w:ilvl w:val="0"/>
+          <w:numId w:val="2"/>
+        </w:numPr>
+        <w:rPr>
+          <w:rFonts w:ascii="Andale Mono" w:hAnsi="Andale Mono"/>
+          <w:sz w:val="28"/>
+          <w:szCs w:val="28"/>
+          <w:lang w:val="en-US"/>
+        </w:rPr>
+      </w:pPr>
+      <w:r>
+        <w:rPr>
+          <w:rFonts w:ascii="Andale Mono" w:hAnsi="Andale Mono"/>
+          <w:sz w:val="28"/>
+          <w:szCs w:val="28"/>
+          <w:lang w:val="en-US"/>
+        </w:rPr>
+        <w:t>We need to store images somewhere like cloud or local</w:t>
+      </w:r>
+    </w:p>
+    <w:p>
+      <w:pPr>
+        <w:pStyle w:val="ListParagraph"/>
+        <w:numPr>
+          <w:ilvl w:val="1"/>
+          <w:numId w:val="2"/>
+        </w:numPr>
+        <w:rPr>
+          <w:rFonts w:ascii="Andale Mono" w:hAnsi="Andale Mono"/>
+          <w:sz w:val="28"/>
+          <w:szCs w:val="28"/>
+          <w:lang w:val="en-US"/>
+        </w:rPr>
+      </w:pPr>
+      <w:r>
+        <w:rPr>
+          <w:rFonts w:ascii="Andale Mono" w:hAnsi="Andale Mono"/>
+          <w:sz w:val="28"/>
+          <w:szCs w:val="28"/>
+          <w:lang w:val="en-US"/>
+        </w:rPr>
+        <w:t>In demo we use cloud (cloudinary)</w:t>
+      </w:r>
+    </w:p>
+    <w:p>
+      <w:pPr>
+        <w:pStyle w:val="ListParagraph"/>
+        <w:numPr>
+          <w:ilvl w:val="1"/>
+          <w:numId w:val="2"/>
+        </w:numPr>
+        <w:rPr>
+          <w:rFonts w:ascii="Andale Mono" w:hAnsi="Andale Mono"/>
+          <w:sz w:val="28"/>
+          <w:szCs w:val="28"/>
+          <w:lang w:val="en-US"/>
+        </w:rPr>
+      </w:pPr>
+      <w:r>
+        <w:rPr>
+          <w:rFonts w:ascii="Andale Mono" w:hAnsi="Andale Mono"/>
+          <w:sz w:val="28"/>
+          <w:szCs w:val="28"/>
+          <w:lang w:val="en-US"/>
+        </w:rPr>
+        <w:t>In real situation it’s up to where is your server, if there is a server you can store in it by using local storage(server)</w:t>
+      </w:r>
+    </w:p>
+    <w:p>
+      <w:pPr>
+        <w:pStyle w:val="ListParagraph"/>
+        <w:numPr>
+          <w:ilvl w:val="0"/>
+          <w:numId w:val="2"/>
+        </w:numPr>
+        <w:rPr>
+          <w:rFonts w:ascii="Andale Mono" w:hAnsi="Andale Mono"/>
+          <w:sz w:val="28"/>
+          <w:szCs w:val="28"/>
           <w:lang w:val="en-US"/>
         </w:rPr>
       </w:pPr>
@@ -1401,6 +1589,119 @@
 <file path=word/numbering.xml><?xml version="1.0" encoding="utf-8"?>
 <w:numbering xmlns:wpc="http://schemas.microsoft.com/office/word/2010/wordprocessingCanvas" xmlns:cx="http://schemas.microsoft.com/office/drawing/2014/chartex" xmlns:cx1="http://schemas.microsoft.com/office/drawing/2015/9/8/chartex" xmlns:cx2="http://schemas.microsoft.com/office/drawing/2015/10/21/chartex" xmlns:cx3="http://schemas.microsoft.com/office/drawing/2016/5/9/chartex" xmlns:cx4="http://schemas.microsoft.com/office/drawing/2016/5/10/chartex" xmlns:cx5="http://schemas.microsoft.com/office/drawing/2016/5/11/chartex" xmlns:cx6="http://schemas.microsoft.com/office/drawing/2016/5/12/chartex" xmlns:cx7="http://schemas.microsoft.com/office/drawing/2016/5/13/chartex" xmlns:cx8="http://schemas.microsoft.com/office/drawing/2016/5/14/chartex" xmlns:mc="http://schemas.openxmlformats.org/markup-compatibility/2006" xmlns:aink="http://schemas.microsoft.com/office/drawing/2016/ink" xmlns:am3d="http://schemas.microsoft.com/office/drawing/2017/model3d" xmlns:o="urn:schemas-microsoft-com:office:office" xmlns:oel="http://schemas.microsoft.com/office/2019/extlst" xmlns:r="http://schemas.openxmlformats.org/officeDocument/2006/relationships" xmlns:m="http://schemas.openxmlformats.org/officeDocument/2006/math" xmlns:v="urn:schemas-microsoft-com:vml" xmlns:wp14="http://schemas.microsoft.com/office/word/2010/wordprocessingDrawing" xmlns:wp="http://schemas.openxmlformats.org/drawingml/2006/wordprocessingDrawing" xmlns:w10="urn:schemas-microsoft-com:office:word" xmlns:w="http://schemas.openxmlformats.org/wordprocessingml/2006/main" xmlns:w14="http://schemas.microsoft.com/office/word/2010/wordml" xmlns:w15="http://schemas.microsoft.com/office/word/2012/wordml" xmlns:w16cex="http://schemas.microsoft.com/office/word/2018/wordml/cex" xmlns:w16cid="http://schemas.microsoft.com/office/word/2016/wordml/cid" xmlns:w16="http://schemas.microsoft.com/office/word/2018/wordml" xmlns:w16du="http://schemas.microsoft.com/office/word/2023/wordml/word16du" xmlns:w16sdtdh="http://schemas.microsoft.com/office/word/2020/wordml/sdtdatahash" xmlns:w16sdtfl="http://schemas.microsoft.com/office/word/2024/wordml/sdtformatlock" xmlns:w16se="http://schemas.microsoft.com/office/word/2015/wordml/symex" xmlns:wpg="http://schemas.microsoft.com/office/word/2010/wordprocessingGroup" xmlns:wpi="http://schemas.microsoft.com/office/word/2010/wordprocessingInk" xmlns:wne="http://schemas.microsoft.com/office/word/2006/wordml" xmlns:wps="http://schemas.microsoft.com/office/word/2010/wordprocessingShape" mc:Ignorable="w14 w15 w16se w16cid w16 w16cex w16sdtdh w16sdtfl w16du wp14">
   <w:abstractNum w:abstractNumId="0" w15:restartNumberingAfterBreak="0">
+    <w:nsid w:val="0A9A6B06"/>
+    <w:multiLevelType w:val="hybridMultilevel"/>
+    <w:tmpl w:val="1A465836"/>
+    <w:lvl w:ilvl="0" w:tplc="04090001">
+      <w:start w:val="1"/>
+      <w:numFmt w:val="bullet"/>
+      <w:lvlText w:val=""/>
+      <w:lvlJc w:val="left"/>
+      <w:pPr>
+        <w:ind w:left="720" w:hanging="360"/>
+      </w:pPr>
+      <w:rPr>
+        <w:rFonts w:ascii="Symbol" w:hAnsi="Symbol" w:hint="default"/>
+      </w:rPr>
+    </w:lvl>
+    <w:lvl w:ilvl="1" w:tplc="04090003">
+      <w:start w:val="1"/>
+      <w:numFmt w:val="bullet"/>
+      <w:lvlText w:val="o"/>
+      <w:lvlJc w:val="left"/>
+      <w:pPr>
+        <w:ind w:left="1440" w:hanging="360"/>
+      </w:pPr>
+      <w:rPr>
+        <w:rFonts w:ascii="Courier New" w:hAnsi="Courier New" w:cs="Courier New" w:hint="default"/>
+      </w:rPr>
+    </w:lvl>
+    <w:lvl w:ilvl="2" w:tplc="04090005" w:tentative="1">
+      <w:start w:val="1"/>
+      <w:numFmt w:val="bullet"/>
+      <w:lvlText w:val=""/>
+      <w:lvlJc w:val="left"/>
+      <w:pPr>
+        <w:ind w:left="2160" w:hanging="360"/>
+      </w:pPr>
+      <w:rPr>
+        <w:rFonts w:ascii="Wingdings" w:hAnsi="Wingdings" w:hint="default"/>
+      </w:rPr>
+    </w:lvl>
+    <w:lvl w:ilvl="3" w:tplc="04090001" w:tentative="1">
+      <w:start w:val="1"/>
+      <w:numFmt w:val="bullet"/>
+      <w:lvlText w:val=""/>
+      <w:lvlJc w:val="left"/>
+      <w:pPr>
+        <w:ind w:left="2880" w:hanging="360"/>
+      </w:pPr>
+      <w:rPr>
+        <w:rFonts w:ascii="Symbol" w:hAnsi="Symbol" w:hint="default"/>
+      </w:rPr>
+    </w:lvl>
+    <w:lvl w:ilvl="4" w:tplc="04090003" w:tentative="1">
+      <w:start w:val="1"/>
+      <w:numFmt w:val="bullet"/>
+      <w:lvlText w:val="o"/>
+      <w:lvlJc w:val="left"/>
+      <w:pPr>
+        <w:ind w:left="3600" w:hanging="360"/>
+      </w:pPr>
+      <w:rPr>
+        <w:rFonts w:ascii="Courier New" w:hAnsi="Courier New" w:cs="Courier New" w:hint="default"/>
+      </w:rPr>
+    </w:lvl>
+    <w:lvl w:ilvl="5" w:tplc="04090005" w:tentative="1">
+      <w:start w:val="1"/>
+      <w:numFmt w:val="bullet"/>
+      <w:lvlText w:val=""/>
+      <w:lvlJc w:val="left"/>
+      <w:pPr>
+        <w:ind w:left="4320" w:hanging="360"/>
+      </w:pPr>
+      <w:rPr>
+        <w:rFonts w:ascii="Wingdings" w:hAnsi="Wingdings" w:hint="default"/>
+      </w:rPr>
+    </w:lvl>
+    <w:lvl w:ilvl="6" w:tplc="04090001" w:tentative="1">
+      <w:start w:val="1"/>
+      <w:numFmt w:val="bullet"/>
+      <w:lvlText w:val=""/>
+      <w:lvlJc w:val="left"/>
+      <w:pPr>
+        <w:ind w:left="5040" w:hanging="360"/>
+      </w:pPr>
+      <w:rPr>
+        <w:rFonts w:ascii="Symbol" w:hAnsi="Symbol" w:hint="default"/>
+      </w:rPr>
+    </w:lvl>
+    <w:lvl w:ilvl="7" w:tplc="04090003" w:tentative="1">
+      <w:start w:val="1"/>
+      <w:numFmt w:val="bullet"/>
+      <w:lvlText w:val="o"/>
+      <w:lvlJc w:val="left"/>
+      <w:pPr>
+        <w:ind w:left="5760" w:hanging="360"/>
+      </w:pPr>
+      <w:rPr>
+        <w:rFonts w:ascii="Courier New" w:hAnsi="Courier New" w:cs="Courier New" w:hint="default"/>
+      </w:rPr>
+    </w:lvl>
+    <w:lvl w:ilvl="8" w:tplc="04090005" w:tentative="1">
+      <w:start w:val="1"/>
+      <w:numFmt w:val="bullet"/>
+      <w:lvlText w:val=""/>
+      <w:lvlJc w:val="left"/>
+      <w:pPr>
+        <w:ind w:left="6480" w:hanging="360"/>
+      </w:pPr>
+      <w:rPr>
+        <w:rFonts w:ascii="Wingdings" w:hAnsi="Wingdings" w:hint="default"/>
+      </w:rPr>
+    </w:lvl>
+  </w:abstractNum>
+  <w:abstractNum w:abstractNumId="1" w15:restartNumberingAfterBreak="0">
     <w:nsid w:val="16D05DE7"/>
     <w:multiLevelType w:val="hybridMultilevel"/>
     <w:tmpl w:val="895AC2AA"/>
@@ -1522,6 +1823,9 @@
     </w:lvl>
   </w:abstractNum>
   <w:num w:numId="1" w16cid:durableId="914242343">
+    <w:abstractNumId w:val="1"/>
+  </w:num>
+  <w:num w:numId="2" w16cid:durableId="187837799">
     <w:abstractNumId w:val="0"/>
   </w:num>
 </w:numbering>

</xml_diff>